<commit_message>
Gameplay doc update with new locations
Full overview of folsom library, available activities, layout, rooms, etc.
</commit_message>
<xml_diff>
--- a/StoryAndGameplay/Let's Go Red GAMEPLAY DOC.docx
+++ b/StoryAndGameplay/Let's Go Red GAMEPLAY DOC.docx
@@ -263,6 +263,30 @@
     </w:p>
     <w:p>
       <w:pPr>
+        <w:numPr>
+          <w:ilvl w:val="0"/>
+          <w:numId w:val="8"/>
+        </w:numPr>
+        <w:ind w:left="1440" w:hanging="360"/>
+        <w:rPr>
+          <w:rFonts w:ascii="Comic Sans MS" w:cs="Comic Sans MS" w:eastAsia="Comic Sans MS" w:hAnsi="Comic Sans MS"/>
+          <w:sz w:val="26"/>
+          <w:szCs w:val="26"/>
+          <w:u w:val="none"/>
+        </w:rPr>
+      </w:pPr>
+      <w:r>
+        <w:rPr>
+          <w:rFonts w:ascii="Comic Sans MS" w:cs="Comic Sans MS" w:eastAsia="Comic Sans MS" w:hAnsi="Comic Sans MS"/>
+          <w:sz w:val="26"/>
+          <w:szCs w:val="26"/>
+          <w:rtl w:val="0"/>
+        </w:rPr>
+        <w:t xml:space="preserve">Folsom Library</w:t>
+      </w:r>
+    </w:p>
+    <w:p>
+      <w:pPr>
         <w:rPr>
           <w:rFonts w:ascii="Comic Sans MS" w:cs="Comic Sans MS" w:eastAsia="Comic Sans MS" w:hAnsi="Comic Sans MS"/>
           <w:sz w:val="26"/>
@@ -2213,6 +2237,572 @@
         <w:t xml:space="preserve">No idea yet because I’ve literally  never been up there. Get more stuff</w:t>
       </w:r>
     </w:p>
+    <w:p>
+      <w:pPr>
+        <w:rPr>
+          <w:rFonts w:ascii="Comic Sans MS" w:cs="Comic Sans MS" w:eastAsia="Comic Sans MS" w:hAnsi="Comic Sans MS"/>
+          <w:sz w:val="26"/>
+          <w:szCs w:val="26"/>
+        </w:rPr>
+      </w:pPr>
+      <w:r>
+        <w:rPr>
+          <w:rtl w:val="0"/>
+        </w:rPr>
+      </w:r>
+    </w:p>
+    <w:p>
+      <w:pPr>
+        <w:rPr>
+          <w:rFonts w:ascii="Comic Sans MS" w:cs="Comic Sans MS" w:eastAsia="Comic Sans MS" w:hAnsi="Comic Sans MS"/>
+          <w:sz w:val="26"/>
+          <w:szCs w:val="26"/>
+        </w:rPr>
+      </w:pPr>
+      <w:r>
+        <w:rPr>
+          <w:rFonts w:ascii="Comic Sans MS" w:cs="Comic Sans MS" w:eastAsia="Comic Sans MS" w:hAnsi="Comic Sans MS"/>
+          <w:sz w:val="26"/>
+          <w:szCs w:val="26"/>
+          <w:rtl w:val="0"/>
+        </w:rPr>
+        <w:t xml:space="preserve">6. Folsom Library</w:t>
+      </w:r>
+    </w:p>
+    <w:p>
+      <w:pPr>
+        <w:rPr>
+          <w:rFonts w:ascii="Comic Sans MS" w:cs="Comic Sans MS" w:eastAsia="Comic Sans MS" w:hAnsi="Comic Sans MS"/>
+          <w:sz w:val="26"/>
+          <w:szCs w:val="26"/>
+        </w:rPr>
+      </w:pPr>
+      <w:r>
+        <w:rPr>
+          <w:rFonts w:ascii="Comic Sans MS" w:cs="Comic Sans MS" w:eastAsia="Comic Sans MS" w:hAnsi="Comic Sans MS"/>
+          <w:sz w:val="26"/>
+          <w:szCs w:val="26"/>
+          <w:rtl w:val="0"/>
+        </w:rPr>
+        <w:t xml:space="preserve">Rooms/Areas</w:t>
+      </w:r>
+    </w:p>
+    <w:p>
+      <w:pPr>
+        <w:numPr>
+          <w:ilvl w:val="0"/>
+          <w:numId w:val="11"/>
+        </w:numPr>
+        <w:ind w:left="720" w:hanging="360"/>
+        <w:rPr>
+          <w:rFonts w:ascii="Comic Sans MS" w:cs="Comic Sans MS" w:eastAsia="Comic Sans MS" w:hAnsi="Comic Sans MS"/>
+          <w:sz w:val="26"/>
+          <w:szCs w:val="26"/>
+          <w:u w:val="none"/>
+        </w:rPr>
+      </w:pPr>
+      <w:r>
+        <w:rPr>
+          <w:rFonts w:ascii="Comic Sans MS" w:cs="Comic Sans MS" w:eastAsia="Comic Sans MS" w:hAnsi="Comic Sans MS"/>
+          <w:sz w:val="26"/>
+          <w:szCs w:val="26"/>
+          <w:rtl w:val="0"/>
+        </w:rPr>
+        <w:t xml:space="preserve">1st floor (bottom)</w:t>
+      </w:r>
+    </w:p>
+    <w:p>
+      <w:pPr>
+        <w:numPr>
+          <w:ilvl w:val="1"/>
+          <w:numId w:val="11"/>
+        </w:numPr>
+        <w:ind w:left="1440" w:hanging="360"/>
+        <w:rPr>
+          <w:rFonts w:ascii="Comic Sans MS" w:cs="Comic Sans MS" w:eastAsia="Comic Sans MS" w:hAnsi="Comic Sans MS"/>
+          <w:sz w:val="26"/>
+          <w:szCs w:val="26"/>
+          <w:u w:val="none"/>
+        </w:rPr>
+      </w:pPr>
+      <w:r>
+        <w:rPr>
+          <w:rFonts w:ascii="Comic Sans MS" w:cs="Comic Sans MS" w:eastAsia="Comic Sans MS" w:hAnsi="Comic Sans MS"/>
+          <w:sz w:val="26"/>
+          <w:szCs w:val="26"/>
+          <w:rtl w:val="0"/>
+        </w:rPr>
+        <w:t xml:space="preserve">Bottom floor of the entire Folsom Library</w:t>
+      </w:r>
+    </w:p>
+    <w:p>
+      <w:pPr>
+        <w:numPr>
+          <w:ilvl w:val="1"/>
+          <w:numId w:val="11"/>
+        </w:numPr>
+        <w:ind w:left="1440" w:hanging="360"/>
+        <w:rPr>
+          <w:rFonts w:ascii="Comic Sans MS" w:cs="Comic Sans MS" w:eastAsia="Comic Sans MS" w:hAnsi="Comic Sans MS"/>
+          <w:sz w:val="26"/>
+          <w:szCs w:val="26"/>
+          <w:u w:val="none"/>
+        </w:rPr>
+      </w:pPr>
+      <w:r>
+        <w:rPr>
+          <w:rFonts w:ascii="Comic Sans MS" w:cs="Comic Sans MS" w:eastAsia="Comic Sans MS" w:hAnsi="Comic Sans MS"/>
+          <w:sz w:val="26"/>
+          <w:szCs w:val="26"/>
+          <w:rtl w:val="0"/>
+        </w:rPr>
+        <w:t xml:space="preserve">Home of Comm D and more importantly Data Structures office hours</w:t>
+      </w:r>
+    </w:p>
+    <w:p>
+      <w:pPr>
+        <w:numPr>
+          <w:ilvl w:val="2"/>
+          <w:numId w:val="11"/>
+        </w:numPr>
+        <w:ind w:left="2160" w:hanging="360"/>
+        <w:rPr>
+          <w:rFonts w:ascii="Comic Sans MS" w:cs="Comic Sans MS" w:eastAsia="Comic Sans MS" w:hAnsi="Comic Sans MS"/>
+          <w:sz w:val="26"/>
+          <w:szCs w:val="26"/>
+          <w:u w:val="none"/>
+        </w:rPr>
+      </w:pPr>
+      <w:r>
+        <w:rPr>
+          <w:rFonts w:ascii="Comic Sans MS" w:cs="Comic Sans MS" w:eastAsia="Comic Sans MS" w:hAnsi="Comic Sans MS"/>
+          <w:sz w:val="26"/>
+          <w:szCs w:val="26"/>
+          <w:rtl w:val="0"/>
+        </w:rPr>
+        <w:t xml:space="preserve">Students in the area waiting to be helped for the past week and a half (the queue hasn’t moved at all)</w:t>
+      </w:r>
+    </w:p>
+    <w:p>
+      <w:pPr>
+        <w:numPr>
+          <w:ilvl w:val="1"/>
+          <w:numId w:val="11"/>
+        </w:numPr>
+        <w:ind w:left="1440" w:hanging="360"/>
+        <w:rPr>
+          <w:rFonts w:ascii="Comic Sans MS" w:cs="Comic Sans MS" w:eastAsia="Comic Sans MS" w:hAnsi="Comic Sans MS"/>
+          <w:sz w:val="26"/>
+          <w:szCs w:val="26"/>
+          <w:u w:val="none"/>
+        </w:rPr>
+      </w:pPr>
+      <w:r>
+        <w:rPr>
+          <w:rFonts w:ascii="Comic Sans MS" w:cs="Comic Sans MS" w:eastAsia="Comic Sans MS" w:hAnsi="Comic Sans MS"/>
+          <w:sz w:val="26"/>
+          <w:szCs w:val="26"/>
+          <w:rtl w:val="0"/>
+        </w:rPr>
+        <w:t xml:space="preserve">Sports a small number of bookshelves</w:t>
+      </w:r>
+    </w:p>
+    <w:p>
+      <w:pPr>
+        <w:numPr>
+          <w:ilvl w:val="0"/>
+          <w:numId w:val="11"/>
+        </w:numPr>
+        <w:ind w:left="720" w:hanging="360"/>
+        <w:rPr>
+          <w:rFonts w:ascii="Comic Sans MS" w:cs="Comic Sans MS" w:eastAsia="Comic Sans MS" w:hAnsi="Comic Sans MS"/>
+          <w:sz w:val="26"/>
+          <w:szCs w:val="26"/>
+          <w:u w:val="none"/>
+        </w:rPr>
+      </w:pPr>
+      <w:r>
+        <w:rPr>
+          <w:rFonts w:ascii="Comic Sans MS" w:cs="Comic Sans MS" w:eastAsia="Comic Sans MS" w:hAnsi="Comic Sans MS"/>
+          <w:sz w:val="26"/>
+          <w:szCs w:val="26"/>
+          <w:rtl w:val="0"/>
+        </w:rPr>
+        <w:t xml:space="preserve">2nd floor (main)</w:t>
+      </w:r>
+    </w:p>
+    <w:p>
+      <w:pPr>
+        <w:numPr>
+          <w:ilvl w:val="1"/>
+          <w:numId w:val="11"/>
+        </w:numPr>
+        <w:ind w:left="1440" w:hanging="360"/>
+        <w:rPr>
+          <w:rFonts w:ascii="Comic Sans MS" w:cs="Comic Sans MS" w:eastAsia="Comic Sans MS" w:hAnsi="Comic Sans MS"/>
+          <w:sz w:val="26"/>
+          <w:szCs w:val="26"/>
+          <w:u w:val="none"/>
+        </w:rPr>
+      </w:pPr>
+      <w:r>
+        <w:rPr>
+          <w:rFonts w:ascii="Comic Sans MS" w:cs="Comic Sans MS" w:eastAsia="Comic Sans MS" w:hAnsi="Comic Sans MS"/>
+          <w:sz w:val="26"/>
+          <w:szCs w:val="26"/>
+          <w:rtl w:val="0"/>
+        </w:rPr>
+        <w:t xml:space="preserve">Main lobby area of the folsom library</w:t>
+      </w:r>
+    </w:p>
+    <w:p>
+      <w:pPr>
+        <w:numPr>
+          <w:ilvl w:val="1"/>
+          <w:numId w:val="11"/>
+        </w:numPr>
+        <w:ind w:left="1440" w:hanging="360"/>
+        <w:rPr>
+          <w:rFonts w:ascii="Comic Sans MS" w:cs="Comic Sans MS" w:eastAsia="Comic Sans MS" w:hAnsi="Comic Sans MS"/>
+          <w:sz w:val="26"/>
+          <w:szCs w:val="26"/>
+          <w:u w:val="none"/>
+        </w:rPr>
+      </w:pPr>
+      <w:r>
+        <w:rPr>
+          <w:rFonts w:ascii="Comic Sans MS" w:cs="Comic Sans MS" w:eastAsia="Comic Sans MS" w:hAnsi="Comic Sans MS"/>
+          <w:sz w:val="26"/>
+          <w:szCs w:val="26"/>
+          <w:rtl w:val="0"/>
+        </w:rPr>
+        <w:t xml:space="preserve">Cafe in the back corner. Despite workers being there, they say they aren’t open.</w:t>
+      </w:r>
+    </w:p>
+    <w:p>
+      <w:pPr>
+        <w:numPr>
+          <w:ilvl w:val="1"/>
+          <w:numId w:val="11"/>
+        </w:numPr>
+        <w:ind w:left="1440" w:hanging="360"/>
+        <w:rPr>
+          <w:rFonts w:ascii="Comic Sans MS" w:cs="Comic Sans MS" w:eastAsia="Comic Sans MS" w:hAnsi="Comic Sans MS"/>
+          <w:sz w:val="26"/>
+          <w:szCs w:val="26"/>
+          <w:u w:val="none"/>
+        </w:rPr>
+      </w:pPr>
+      <w:r>
+        <w:rPr>
+          <w:rFonts w:ascii="Comic Sans MS" w:cs="Comic Sans MS" w:eastAsia="Comic Sans MS" w:hAnsi="Comic Sans MS"/>
+          <w:sz w:val="26"/>
+          <w:szCs w:val="26"/>
+          <w:rtl w:val="0"/>
+        </w:rPr>
+        <w:t xml:space="preserve">Able to speak with some students in the area to get some lorea about what is happening</w:t>
+      </w:r>
+    </w:p>
+    <w:p>
+      <w:pPr>
+        <w:numPr>
+          <w:ilvl w:val="1"/>
+          <w:numId w:val="11"/>
+        </w:numPr>
+        <w:ind w:left="1440" w:hanging="360"/>
+        <w:rPr>
+          <w:rFonts w:ascii="Comic Sans MS" w:cs="Comic Sans MS" w:eastAsia="Comic Sans MS" w:hAnsi="Comic Sans MS"/>
+          <w:sz w:val="26"/>
+          <w:szCs w:val="26"/>
+          <w:u w:val="none"/>
+        </w:rPr>
+      </w:pPr>
+      <w:r>
+        <w:rPr>
+          <w:rFonts w:ascii="Comic Sans MS" w:cs="Comic Sans MS" w:eastAsia="Comic Sans MS" w:hAnsi="Comic Sans MS"/>
+          <w:sz w:val="26"/>
+          <w:szCs w:val="26"/>
+          <w:rtl w:val="0"/>
+        </w:rPr>
+        <w:t xml:space="preserve">Speak to the front desk </w:t>
+      </w:r>
+      <w:r>
+        <w:rPr>
+          <w:rFonts w:ascii="Comic Sans MS" w:cs="Comic Sans MS" w:eastAsia="Comic Sans MS" w:hAnsi="Comic Sans MS"/>
+          <w:sz w:val="26"/>
+          <w:szCs w:val="26"/>
+          <w:rtl w:val="0"/>
+        </w:rPr>
+        <w:t xml:space="preserve">for</w:t>
+      </w:r>
+      <w:r>
+        <w:rPr>
+          <w:rFonts w:ascii="Comic Sans MS" w:cs="Comic Sans MS" w:eastAsia="Comic Sans MS" w:hAnsi="Comic Sans MS"/>
+          <w:sz w:val="26"/>
+          <w:szCs w:val="26"/>
+          <w:rtl w:val="0"/>
+        </w:rPr>
+        <w:t xml:space="preserve"> </w:t>
+      </w:r>
+      <w:r>
+        <w:rPr>
+          <w:rFonts w:ascii="Comic Sans MS" w:cs="Comic Sans MS" w:eastAsia="Comic Sans MS" w:hAnsi="Comic Sans MS"/>
+          <w:sz w:val="26"/>
+          <w:szCs w:val="26"/>
+          <w:rtl w:val="0"/>
+        </w:rPr>
+        <w:t xml:space="preserve">finding</w:t>
+      </w:r>
+      <w:r>
+        <w:rPr>
+          <w:rFonts w:ascii="Comic Sans MS" w:cs="Comic Sans MS" w:eastAsia="Comic Sans MS" w:hAnsi="Comic Sans MS"/>
+          <w:sz w:val="26"/>
+          <w:szCs w:val="26"/>
+          <w:rtl w:val="0"/>
+        </w:rPr>
+        <w:t xml:space="preserve"> a book quest. You get a dewey decimal system number and you need to roam the shelves until you find the book and get it back. Get a study room master key as a reward (unlocks any study room). Used for progression, also might find some useful stuff inside these rooms</w:t>
+      </w:r>
+    </w:p>
+    <w:p>
+      <w:pPr>
+        <w:numPr>
+          <w:ilvl w:val="0"/>
+          <w:numId w:val="11"/>
+        </w:numPr>
+        <w:ind w:left="720" w:hanging="360"/>
+        <w:rPr>
+          <w:rFonts w:ascii="Comic Sans MS" w:cs="Comic Sans MS" w:eastAsia="Comic Sans MS" w:hAnsi="Comic Sans MS"/>
+          <w:sz w:val="26"/>
+          <w:szCs w:val="26"/>
+          <w:u w:val="none"/>
+        </w:rPr>
+      </w:pPr>
+      <w:r>
+        <w:rPr>
+          <w:rFonts w:ascii="Comic Sans MS" w:cs="Comic Sans MS" w:eastAsia="Comic Sans MS" w:hAnsi="Comic Sans MS"/>
+          <w:sz w:val="26"/>
+          <w:szCs w:val="26"/>
+          <w:rtl w:val="0"/>
+        </w:rPr>
+        <w:t xml:space="preserve">3rd floor (library)</w:t>
+      </w:r>
+    </w:p>
+    <w:p>
+      <w:pPr>
+        <w:numPr>
+          <w:ilvl w:val="1"/>
+          <w:numId w:val="11"/>
+        </w:numPr>
+        <w:ind w:left="1440" w:hanging="360"/>
+        <w:rPr>
+          <w:rFonts w:ascii="Comic Sans MS" w:cs="Comic Sans MS" w:eastAsia="Comic Sans MS" w:hAnsi="Comic Sans MS"/>
+          <w:sz w:val="26"/>
+          <w:szCs w:val="26"/>
+          <w:u w:val="none"/>
+        </w:rPr>
+      </w:pPr>
+      <w:r>
+        <w:rPr>
+          <w:rFonts w:ascii="Comic Sans MS" w:cs="Comic Sans MS" w:eastAsia="Comic Sans MS" w:hAnsi="Comic Sans MS"/>
+          <w:sz w:val="26"/>
+          <w:szCs w:val="26"/>
+          <w:rtl w:val="0"/>
+        </w:rPr>
+        <w:t xml:space="preserve">Mostly has some books on this floor</w:t>
+      </w:r>
+    </w:p>
+    <w:p>
+      <w:pPr>
+        <w:numPr>
+          <w:ilvl w:val="1"/>
+          <w:numId w:val="11"/>
+        </w:numPr>
+        <w:ind w:left="1440" w:hanging="360"/>
+        <w:rPr>
+          <w:rFonts w:ascii="Comic Sans MS" w:cs="Comic Sans MS" w:eastAsia="Comic Sans MS" w:hAnsi="Comic Sans MS"/>
+          <w:sz w:val="26"/>
+          <w:szCs w:val="26"/>
+          <w:u w:val="none"/>
+        </w:rPr>
+      </w:pPr>
+      <w:r>
+        <w:rPr>
+          <w:rFonts w:ascii="Comic Sans MS" w:cs="Comic Sans MS" w:eastAsia="Comic Sans MS" w:hAnsi="Comic Sans MS"/>
+          <w:sz w:val="26"/>
+          <w:szCs w:val="26"/>
+          <w:rtl w:val="0"/>
+        </w:rPr>
+        <w:t xml:space="preserve">Archives room in one part of this floor</w:t>
+      </w:r>
+    </w:p>
+    <w:p>
+      <w:pPr>
+        <w:numPr>
+          <w:ilvl w:val="2"/>
+          <w:numId w:val="11"/>
+        </w:numPr>
+        <w:ind w:left="2160" w:hanging="360"/>
+        <w:rPr>
+          <w:rFonts w:ascii="Comic Sans MS" w:cs="Comic Sans MS" w:eastAsia="Comic Sans MS" w:hAnsi="Comic Sans MS"/>
+          <w:sz w:val="26"/>
+          <w:szCs w:val="26"/>
+          <w:u w:val="none"/>
+        </w:rPr>
+      </w:pPr>
+      <w:r>
+        <w:rPr>
+          <w:rFonts w:ascii="Comic Sans MS" w:cs="Comic Sans MS" w:eastAsia="Comic Sans MS" w:hAnsi="Comic Sans MS"/>
+          <w:sz w:val="26"/>
+          <w:szCs w:val="26"/>
+          <w:rtl w:val="0"/>
+        </w:rPr>
+        <w:t xml:space="preserve">Go in and speak to archivist and maybe get some useful things that were stored in the archives</w:t>
+      </w:r>
+    </w:p>
+    <w:p>
+      <w:pPr>
+        <w:numPr>
+          <w:ilvl w:val="0"/>
+          <w:numId w:val="11"/>
+        </w:numPr>
+        <w:ind w:left="720" w:hanging="360"/>
+        <w:rPr>
+          <w:rFonts w:ascii="Comic Sans MS" w:cs="Comic Sans MS" w:eastAsia="Comic Sans MS" w:hAnsi="Comic Sans MS"/>
+          <w:sz w:val="26"/>
+          <w:szCs w:val="26"/>
+          <w:u w:val="none"/>
+        </w:rPr>
+      </w:pPr>
+      <w:r>
+        <w:rPr>
+          <w:rFonts w:ascii="Comic Sans MS" w:cs="Comic Sans MS" w:eastAsia="Comic Sans MS" w:hAnsi="Comic Sans MS"/>
+          <w:sz w:val="26"/>
+          <w:szCs w:val="26"/>
+          <w:rtl w:val="0"/>
+        </w:rPr>
+        <w:t xml:space="preserve">4th floor (library)</w:t>
+      </w:r>
+    </w:p>
+    <w:p>
+      <w:pPr>
+        <w:numPr>
+          <w:ilvl w:val="1"/>
+          <w:numId w:val="11"/>
+        </w:numPr>
+        <w:ind w:left="1440" w:hanging="360"/>
+        <w:rPr>
+          <w:rFonts w:ascii="Comic Sans MS" w:cs="Comic Sans MS" w:eastAsia="Comic Sans MS" w:hAnsi="Comic Sans MS"/>
+          <w:sz w:val="26"/>
+          <w:szCs w:val="26"/>
+          <w:u w:val="none"/>
+        </w:rPr>
+      </w:pPr>
+      <w:r>
+        <w:rPr>
+          <w:rFonts w:ascii="Comic Sans MS" w:cs="Comic Sans MS" w:eastAsia="Comic Sans MS" w:hAnsi="Comic Sans MS"/>
+          <w:sz w:val="26"/>
+          <w:szCs w:val="26"/>
+          <w:rtl w:val="0"/>
+        </w:rPr>
+        <w:t xml:space="preserve">Book sidquest book is stored on this floor</w:t>
+      </w:r>
+    </w:p>
+    <w:p>
+      <w:pPr>
+        <w:numPr>
+          <w:ilvl w:val="1"/>
+          <w:numId w:val="11"/>
+        </w:numPr>
+        <w:ind w:left="1440" w:hanging="360"/>
+        <w:rPr>
+          <w:rFonts w:ascii="Comic Sans MS" w:cs="Comic Sans MS" w:eastAsia="Comic Sans MS" w:hAnsi="Comic Sans MS"/>
+          <w:sz w:val="26"/>
+          <w:szCs w:val="26"/>
+          <w:u w:val="none"/>
+        </w:rPr>
+      </w:pPr>
+      <w:r>
+        <w:rPr>
+          <w:rFonts w:ascii="Comic Sans MS" w:cs="Comic Sans MS" w:eastAsia="Comic Sans MS" w:hAnsi="Comic Sans MS"/>
+          <w:sz w:val="26"/>
+          <w:szCs w:val="26"/>
+          <w:rtl w:val="0"/>
+        </w:rPr>
+        <w:t xml:space="preserve">Some students locked themselves in a study room, let them out to gather more info and progress story. Need study room master key.</w:t>
+      </w:r>
+    </w:p>
+    <w:p>
+      <w:pPr>
+        <w:numPr>
+          <w:ilvl w:val="0"/>
+          <w:numId w:val="11"/>
+        </w:numPr>
+        <w:ind w:left="720" w:hanging="360"/>
+        <w:rPr>
+          <w:rFonts w:ascii="Comic Sans MS" w:cs="Comic Sans MS" w:eastAsia="Comic Sans MS" w:hAnsi="Comic Sans MS"/>
+          <w:sz w:val="26"/>
+          <w:szCs w:val="26"/>
+          <w:u w:val="none"/>
+        </w:rPr>
+      </w:pPr>
+      <w:r>
+        <w:rPr>
+          <w:rFonts w:ascii="Comic Sans MS" w:cs="Comic Sans MS" w:eastAsia="Comic Sans MS" w:hAnsi="Comic Sans MS"/>
+          <w:sz w:val="26"/>
+          <w:szCs w:val="26"/>
+          <w:rtl w:val="0"/>
+        </w:rPr>
+        <w:t xml:space="preserve">5th floor (secret)</w:t>
+      </w:r>
+    </w:p>
+    <w:p>
+      <w:pPr>
+        <w:numPr>
+          <w:ilvl w:val="1"/>
+          <w:numId w:val="11"/>
+        </w:numPr>
+        <w:ind w:left="1440" w:hanging="360"/>
+        <w:rPr>
+          <w:rFonts w:ascii="Comic Sans MS" w:cs="Comic Sans MS" w:eastAsia="Comic Sans MS" w:hAnsi="Comic Sans MS"/>
+          <w:sz w:val="26"/>
+          <w:szCs w:val="26"/>
+          <w:u w:val="none"/>
+        </w:rPr>
+      </w:pPr>
+      <w:r>
+        <w:rPr>
+          <w:rFonts w:ascii="Comic Sans MS" w:cs="Comic Sans MS" w:eastAsia="Comic Sans MS" w:hAnsi="Comic Sans MS"/>
+          <w:sz w:val="26"/>
+          <w:szCs w:val="26"/>
+          <w:rtl w:val="0"/>
+        </w:rPr>
+        <w:t xml:space="preserve">Something funny/evil</w:t>
+      </w:r>
+    </w:p>
+    <w:p>
+      <w:pPr>
+        <w:numPr>
+          <w:ilvl w:val="1"/>
+          <w:numId w:val="11"/>
+        </w:numPr>
+        <w:ind w:left="1440" w:hanging="360"/>
+        <w:rPr>
+          <w:rFonts w:ascii="Comic Sans MS" w:cs="Comic Sans MS" w:eastAsia="Comic Sans MS" w:hAnsi="Comic Sans MS"/>
+          <w:sz w:val="26"/>
+          <w:szCs w:val="26"/>
+          <w:u w:val="none"/>
+        </w:rPr>
+      </w:pPr>
+      <w:r>
+        <w:rPr>
+          <w:rFonts w:ascii="Comic Sans MS" w:cs="Comic Sans MS" w:eastAsia="Comic Sans MS" w:hAnsi="Comic Sans MS"/>
+          <w:sz w:val="26"/>
+          <w:szCs w:val="26"/>
+          <w:rtl w:val="0"/>
+        </w:rPr>
+        <w:t xml:space="preserve">The 5th floor irl is completely sanctioned off so its a complete mystery to me</w:t>
+      </w:r>
+    </w:p>
     <w:sectPr>
       <w:pgSz w:h="15840" w:w="12240" w:orient="portrait"/>
       <w:pgMar w:bottom="1440" w:top="1440" w:left="1440" w:right="1440" w:header="720" w:footer="720"/>
@@ -3318,6 +3908,116 @@
       <w:lvlJc w:val="left"/>
       <w:pPr>
         <w:ind w:left="7200" w:hanging="360"/>
+      </w:pPr>
+      <w:rPr>
+        <w:u w:val="none"/>
+      </w:rPr>
+    </w:lvl>
+  </w:abstractNum>
+  <w:abstractNum w:abstractNumId="11">
+    <w:lvl w:ilvl="0">
+      <w:start w:val="1"/>
+      <w:numFmt w:val="lowerLetter"/>
+      <w:lvlText w:val="%1."/>
+      <w:lvlJc w:val="left"/>
+      <w:pPr>
+        <w:ind w:left="720" w:hanging="360"/>
+      </w:pPr>
+      <w:rPr>
+        <w:u w:val="none"/>
+      </w:rPr>
+    </w:lvl>
+    <w:lvl w:ilvl="1">
+      <w:start w:val="1"/>
+      <w:numFmt w:val="lowerRoman"/>
+      <w:lvlText w:val="%2."/>
+      <w:lvlJc w:val="right"/>
+      <w:pPr>
+        <w:ind w:left="1440" w:hanging="360"/>
+      </w:pPr>
+      <w:rPr>
+        <w:u w:val="none"/>
+      </w:rPr>
+    </w:lvl>
+    <w:lvl w:ilvl="2">
+      <w:start w:val="1"/>
+      <w:numFmt w:val="decimal"/>
+      <w:lvlText w:val="%3."/>
+      <w:lvlJc w:val="left"/>
+      <w:pPr>
+        <w:ind w:left="2160" w:hanging="360"/>
+      </w:pPr>
+      <w:rPr>
+        <w:u w:val="none"/>
+      </w:rPr>
+    </w:lvl>
+    <w:lvl w:ilvl="3">
+      <w:start w:val="1"/>
+      <w:numFmt w:val="lowerLetter"/>
+      <w:lvlText w:val="%4."/>
+      <w:lvlJc w:val="left"/>
+      <w:pPr>
+        <w:ind w:left="2880" w:hanging="360"/>
+      </w:pPr>
+      <w:rPr>
+        <w:u w:val="none"/>
+      </w:rPr>
+    </w:lvl>
+    <w:lvl w:ilvl="4">
+      <w:start w:val="1"/>
+      <w:numFmt w:val="lowerRoman"/>
+      <w:lvlText w:val="%5."/>
+      <w:lvlJc w:val="right"/>
+      <w:pPr>
+        <w:ind w:left="3600" w:hanging="360"/>
+      </w:pPr>
+      <w:rPr>
+        <w:u w:val="none"/>
+      </w:rPr>
+    </w:lvl>
+    <w:lvl w:ilvl="5">
+      <w:start w:val="1"/>
+      <w:numFmt w:val="decimal"/>
+      <w:lvlText w:val="%6."/>
+      <w:lvlJc w:val="left"/>
+      <w:pPr>
+        <w:ind w:left="4320" w:hanging="360"/>
+      </w:pPr>
+      <w:rPr>
+        <w:u w:val="none"/>
+      </w:rPr>
+    </w:lvl>
+    <w:lvl w:ilvl="6">
+      <w:start w:val="1"/>
+      <w:numFmt w:val="lowerLetter"/>
+      <w:lvlText w:val="%7."/>
+      <w:lvlJc w:val="left"/>
+      <w:pPr>
+        <w:ind w:left="5040" w:hanging="360"/>
+      </w:pPr>
+      <w:rPr>
+        <w:u w:val="none"/>
+      </w:rPr>
+    </w:lvl>
+    <w:lvl w:ilvl="7">
+      <w:start w:val="1"/>
+      <w:numFmt w:val="lowerRoman"/>
+      <w:lvlText w:val="%8."/>
+      <w:lvlJc w:val="right"/>
+      <w:pPr>
+        <w:ind w:left="5760" w:hanging="360"/>
+      </w:pPr>
+      <w:rPr>
+        <w:u w:val="none"/>
+      </w:rPr>
+    </w:lvl>
+    <w:lvl w:ilvl="8">
+      <w:start w:val="1"/>
+      <w:numFmt w:val="decimal"/>
+      <w:lvlText w:val="%9."/>
+      <w:lvlJc w:val="left"/>
+      <w:pPr>
+        <w:ind w:left="6480" w:hanging="360"/>
       </w:pPr>
       <w:rPr>
         <w:u w:val="none"/>
@@ -3353,6 +4053,9 @@
   </w:num>
   <w:num w:numId="10">
     <w:abstractNumId w:val="10"/>
+  </w:num>
+  <w:num w:numId="11">
+    <w:abstractNumId w:val="11"/>
   </w:num>
 </w:numbering>
 </file>

</xml_diff>